<commit_message>
fix: align algorithm exercises with time complexity scope
</commit_message>
<xml_diff>
--- a/data/알고리즘/1장_연습문제_50문항.docx
+++ b/data/알고리즘/1장_연습문제_50문항.docx
@@ -6035,7 +6035,7 @@
           <w:sz w:val="21"/>
           <w:szCs w:val="21"/>
         </w:rPr>
-        <w:t xml:space="preserve">41. </w:t>
+        <w:t xml:space="preserve">41. 시간 복잡도가 입력 크기에 따라 무엇의 증가 정도를 평가하는 척도인지 쓰시오.</w:t>
       </w:r>
       <w:r>
         <w:rPr>
@@ -6044,7 +6044,7 @@
           <w:sz w:val="21"/>
           <w:szCs w:val="21"/>
         </w:rPr>
-        <w:t xml:space="preserve">시간 복잡도와 공간 복잡도가 각각 무엇을 평가하는 척도인지 쓰시오.</w:t>
+        <w:t xml:space="preserve"/>
       </w:r>
     </w:p>
     <w:p>
@@ -13363,18 +13363,18 @@
           <w:sz w:val="20"/>
           <w:szCs w:val="20"/>
         </w:rPr>
-        <w:t xml:space="preserve">41. </w:t>
-      </w:r>
-      <w:r>
-        <w:rPr>
-          <w:rFonts w:ascii="Malgun Gothic" w:cs="Malgun Gothic" w:eastAsia="Malgun Gothic" w:hAnsi="Malgun Gothic"/>
-          <w:b/>
-          <w:bCs/>
-          <w:color w:val="1A1A2E"/>
-          <w:sz w:val="20"/>
-          <w:szCs w:val="20"/>
-        </w:rPr>
-        <w:t xml:space="preserve">시간 복잡도와 공간 복잡도가 각각 무엇을 평가하는 척도인지 쓰시오.</w:t>
+        <w:t xml:space="preserve">41. 시간 복잡도가 입력 크기에 따라 무엇의 증가 정도를 평가하는 척도인지 쓰시오.</w:t>
+      </w:r>
+      <w:r>
+        <w:rPr>
+          <w:rFonts w:ascii="Malgun Gothic" w:cs="Malgun Gothic" w:eastAsia="Malgun Gothic" w:hAnsi="Malgun Gothic"/>
+          <w:b/>
+          <w:bCs/>
+          <w:color w:val="1A1A2E"/>
+          <w:sz w:val="20"/>
+          <w:szCs w:val="20"/>
+        </w:rPr>
+        <w:t xml:space="preserve"/>
       </w:r>
     </w:p>
     <w:p>
@@ -13391,18 +13391,18 @@
           <w:sz w:val="19"/>
           <w:szCs w:val="19"/>
         </w:rPr>
-        <w:t xml:space="preserve">정답:  </w:t>
-      </w:r>
-      <w:r>
-        <w:rPr>
-          <w:rFonts w:ascii="Malgun Gothic" w:cs="Malgun Gothic" w:eastAsia="Malgun Gothic" w:hAnsi="Malgun Gothic"/>
-          <w:b/>
-          <w:bCs/>
-          <w:color w:val="1A1A2E"/>
-          <w:sz w:val="19"/>
-          <w:szCs w:val="19"/>
-        </w:rPr>
-        <w:t xml:space="preserve">시간 복잡도는 실행 시간, 공간 복잡도는 메모리 사용량</w:t>
+        <w:t xml:space="preserve">정답:  입력 크기에 따른 기본 연산 횟수의 증가 정도</w:t>
+      </w:r>
+      <w:r>
+        <w:rPr>
+          <w:rFonts w:ascii="Malgun Gothic" w:cs="Malgun Gothic" w:eastAsia="Malgun Gothic" w:hAnsi="Malgun Gothic"/>
+          <w:b/>
+          <w:bCs/>
+          <w:color w:val="1A1A2E"/>
+          <w:sz w:val="19"/>
+          <w:szCs w:val="19"/>
+        </w:rPr>
+        <w:t xml:space="preserve"/>
       </w:r>
     </w:p>
     <w:p>
@@ -13430,7 +13430,7 @@
           <w:sz w:val="19"/>
           <w:szCs w:val="19"/>
         </w:rPr>
-        <w:t xml:space="preserve">둘은 보통 트레이드오프 관계이며, 이 과목에서는 주로 시간 복잡도를 다룬다.</w:t>
+        <w:t xml:space="preserve">입력이 커질 때 비교·대입 등 기본 연산 횟수가 어떻게 늘어나는지 평가한다.</w:t>
       </w:r>
     </w:p>
     <w:p>

</xml_diff>

<commit_message>
fix: clarify algorithm exercises and reduce calculation burden
</commit_message>
<xml_diff>
--- a/data/알고리즘/1장_연습문제_50문항.docx
+++ b/data/알고리즘/1장_연습문제_50문항.docx
@@ -3250,7 +3250,7 @@
           <w:sz w:val="21"/>
           <w:szCs w:val="21"/>
         </w:rPr>
-        <w:t xml:space="preserve">17. </w:t>
+        <w:t xml:space="preserve">17. 정렬된 원소가 1,000,000개다. 순차 탐색은 최대 1,000,000회, 이진 탐색은 약 20회 비교한다. 순차 탐색의 비교 횟수는 이진 탐색의 약 몇 배인가?</w:t>
       </w:r>
       <w:r>
         <w:rPr>
@@ -3259,82 +3259,82 @@
           <w:sz w:val="21"/>
           <w:szCs w:val="21"/>
         </w:rPr>
-        <w:t xml:space="preserve">정렬된 데이터에서 순차 탐색의 최대 비교 횟수는 n회, 이진 탐색은 약 log₂n회다. 두 값의 비율이 약 50,000배가 되는 데이터 개수 n은?</w:t>
-      </w:r>
-    </w:p>
-    <w:p>
-      <w:pPr>
-        <w:spacing w:after="20" w:line="276"/>
-        <w:ind w:left="760" w:hanging="320"/>
-      </w:pPr>
-      <w:r>
-        <w:rPr>
-          <w:rFonts w:ascii="Malgun Gothic" w:cs="Malgun Gothic" w:eastAsia="Malgun Gothic" w:hAnsi="Malgun Gothic"/>
-          <w:color w:val="1A1A2E"/>
-          <w:sz w:val="20"/>
-          <w:szCs w:val="20"/>
-        </w:rPr>
-        <w:t xml:space="preserve">① 32</w:t>
-      </w:r>
-    </w:p>
-    <w:p>
-      <w:pPr>
-        <w:spacing w:after="20" w:line="276"/>
-        <w:ind w:left="760" w:hanging="320"/>
-      </w:pPr>
-      <w:r>
-        <w:rPr>
-          <w:rFonts w:ascii="Malgun Gothic" w:cs="Malgun Gothic" w:eastAsia="Malgun Gothic" w:hAnsi="Malgun Gothic"/>
-          <w:color w:val="1A1A2E"/>
-          <w:sz w:val="20"/>
-          <w:szCs w:val="20"/>
-        </w:rPr>
-        <w:t xml:space="preserve">② 1,000</w:t>
-      </w:r>
-    </w:p>
-    <w:p>
-      <w:pPr>
-        <w:spacing w:after="20" w:line="276"/>
-        <w:ind w:left="760" w:hanging="320"/>
-      </w:pPr>
-      <w:r>
-        <w:rPr>
-          <w:rFonts w:ascii="Malgun Gothic" w:cs="Malgun Gothic" w:eastAsia="Malgun Gothic" w:hAnsi="Malgun Gothic"/>
-          <w:color w:val="1A1A2E"/>
-          <w:sz w:val="20"/>
-          <w:szCs w:val="20"/>
-        </w:rPr>
-        <w:t xml:space="preserve">③ 10,000</w:t>
-      </w:r>
-    </w:p>
-    <w:p>
-      <w:pPr>
-        <w:spacing w:after="20" w:line="276"/>
-        <w:ind w:left="760" w:hanging="320"/>
-      </w:pPr>
-      <w:r>
-        <w:rPr>
-          <w:rFonts w:ascii="Malgun Gothic" w:cs="Malgun Gothic" w:eastAsia="Malgun Gothic" w:hAnsi="Malgun Gothic"/>
-          <w:color w:val="1A1A2E"/>
-          <w:sz w:val="20"/>
-          <w:szCs w:val="20"/>
-        </w:rPr>
-        <w:t xml:space="preserve">④ 1,000,000</w:t>
-      </w:r>
-    </w:p>
-    <w:p>
-      <w:pPr>
-        <w:spacing w:after="20" w:line="276"/>
-        <w:ind w:left="760" w:hanging="320"/>
-      </w:pPr>
-      <w:r>
-        <w:rPr>
-          <w:rFonts w:ascii="Malgun Gothic" w:cs="Malgun Gothic" w:eastAsia="Malgun Gothic" w:hAnsi="Malgun Gothic"/>
-          <w:color w:val="1A1A2E"/>
-          <w:sz w:val="20"/>
-          <w:szCs w:val="20"/>
-        </w:rPr>
-        <w:t xml:space="preserve">⑤ 1,000,000,000</w:t>
+        <w:t xml:space="preserve"/>
+      </w:r>
+    </w:p>
+    <w:p>
+      <w:pPr>
+        <w:spacing w:after="20" w:line="276"/>
+        <w:ind w:left="760" w:hanging="320"/>
+      </w:pPr>
+      <w:r>
+        <w:rPr>
+          <w:rFonts w:ascii="Malgun Gothic" w:cs="Malgun Gothic" w:eastAsia="Malgun Gothic" w:hAnsi="Malgun Gothic"/>
+          <w:color w:val="1A1A2E"/>
+          <w:sz w:val="20"/>
+          <w:szCs w:val="20"/>
+        </w:rPr>
+        <w:t xml:space="preserve">① 5배</w:t>
+      </w:r>
+    </w:p>
+    <w:p>
+      <w:pPr>
+        <w:spacing w:after="20" w:line="276"/>
+        <w:ind w:left="760" w:hanging="320"/>
+      </w:pPr>
+      <w:r>
+        <w:rPr>
+          <w:rFonts w:ascii="Malgun Gothic" w:cs="Malgun Gothic" w:eastAsia="Malgun Gothic" w:hAnsi="Malgun Gothic"/>
+          <w:color w:val="1A1A2E"/>
+          <w:sz w:val="20"/>
+          <w:szCs w:val="20"/>
+        </w:rPr>
+        <w:t xml:space="preserve">② 20배</w:t>
+      </w:r>
+    </w:p>
+    <w:p>
+      <w:pPr>
+        <w:spacing w:after="20" w:line="276"/>
+        <w:ind w:left="760" w:hanging="320"/>
+      </w:pPr>
+      <w:r>
+        <w:rPr>
+          <w:rFonts w:ascii="Malgun Gothic" w:cs="Malgun Gothic" w:eastAsia="Malgun Gothic" w:hAnsi="Malgun Gothic"/>
+          <w:color w:val="1A1A2E"/>
+          <w:sz w:val="20"/>
+          <w:szCs w:val="20"/>
+        </w:rPr>
+        <w:t xml:space="preserve">③ 1,000배</w:t>
+      </w:r>
+    </w:p>
+    <w:p>
+      <w:pPr>
+        <w:spacing w:after="20" w:line="276"/>
+        <w:ind w:left="760" w:hanging="320"/>
+      </w:pPr>
+      <w:r>
+        <w:rPr>
+          <w:rFonts w:ascii="Malgun Gothic" w:cs="Malgun Gothic" w:eastAsia="Malgun Gothic" w:hAnsi="Malgun Gothic"/>
+          <w:color w:val="1A1A2E"/>
+          <w:sz w:val="20"/>
+          <w:szCs w:val="20"/>
+        </w:rPr>
+        <w:t xml:space="preserve">④ 50,000배</w:t>
+      </w:r>
+    </w:p>
+    <w:p>
+      <w:pPr>
+        <w:spacing w:after="20" w:line="276"/>
+        <w:ind w:left="760" w:hanging="320"/>
+      </w:pPr>
+      <w:r>
+        <w:rPr>
+          <w:rFonts w:ascii="Malgun Gothic" w:cs="Malgun Gothic" w:eastAsia="Malgun Gothic" w:hAnsi="Malgun Gothic"/>
+          <w:color w:val="1A1A2E"/>
+          <w:sz w:val="20"/>
+          <w:szCs w:val="20"/>
+        </w:rPr>
+        <w:t xml:space="preserve">⑤ 1,000,000배</w:t>
       </w:r>
     </w:p>
     <w:p>
@@ -4561,7 +4561,7 @@
           <w:sz w:val="21"/>
           <w:szCs w:val="21"/>
         </w:rPr>
-        <w:t xml:space="preserve">26. </w:t>
+        <w:t xml:space="preserve">26. T(n)=3n²+5n+100에서 최고차항만 남기고 계수를 생략한 빅오 표기는?</w:t>
       </w:r>
       <w:r>
         <w:rPr>
@@ -4570,7 +4570,7 @@
           <w:sz w:val="21"/>
           <w:szCs w:val="21"/>
         </w:rPr>
-        <w:t xml:space="preserve">T(n) = 3n² + 5n + 100 을 빅오 표기법으로 나타내면?</w:t>
+        <w:t xml:space="preserve"/>
       </w:r>
     </w:p>
     <w:p>
@@ -4630,22 +4630,22 @@
           <w:sz w:val="20"/>
           <w:szCs w:val="20"/>
         </w:rPr>
-        <w:t xml:space="preserve">④ O(3n²)</w:t>
-      </w:r>
-    </w:p>
-    <w:p>
-      <w:pPr>
-        <w:spacing w:after="20" w:line="276"/>
-        <w:ind w:left="760" w:hanging="320"/>
-      </w:pPr>
-      <w:r>
-        <w:rPr>
-          <w:rFonts w:ascii="Malgun Gothic" w:cs="Malgun Gothic" w:eastAsia="Malgun Gothic" w:hAnsi="Malgun Gothic"/>
-          <w:color w:val="1A1A2E"/>
-          <w:sz w:val="20"/>
-          <w:szCs w:val="20"/>
-        </w:rPr>
-        <w:t xml:space="preserve">⑤ O(n² + n)</w:t>
+        <w:t xml:space="preserve">④ O(n³)</w:t>
+      </w:r>
+    </w:p>
+    <w:p>
+      <w:pPr>
+        <w:spacing w:after="20" w:line="276"/>
+        <w:ind w:left="760" w:hanging="320"/>
+      </w:pPr>
+      <w:r>
+        <w:rPr>
+          <w:rFonts w:ascii="Malgun Gothic" w:cs="Malgun Gothic" w:eastAsia="Malgun Gothic" w:hAnsi="Malgun Gothic"/>
+          <w:color w:val="1A1A2E"/>
+          <w:sz w:val="20"/>
+          <w:szCs w:val="20"/>
+        </w:rPr>
+        <w:t xml:space="preserve">⑤ O(2ⁿ)</w:t>
       </w:r>
     </w:p>
     <w:p>
@@ -6127,7 +6127,7 @@
           <w:sz w:val="21"/>
           <w:szCs w:val="21"/>
         </w:rPr>
-        <w:t xml:space="preserve">43. </w:t>
+        <w:t xml:space="preserve">43. 안쪽 반복문의 덧셈 실행 횟수 T(n)은? (n=len(A), 다른 연산은 제외)</w:t>
       </w:r>
       <w:r>
         <w:rPr>
@@ -6136,7 +6136,7 @@
           <w:sz w:val="21"/>
           <w:szCs w:val="21"/>
         </w:rPr>
-        <w:t xml:space="preserve">다음 코드의 T(n)을 쓰시오. (n = len(A))</w:t>
+        <w:t xml:space="preserve"/>
       </w:r>
     </w:p>
     <w:p>
@@ -6632,7 +6632,7 @@
           <w:sz w:val="21"/>
           <w:szCs w:val="21"/>
         </w:rPr>
-        <w:t xml:space="preserve">47. </w:t>
+        <w:t xml:space="preserve">47. T(n)=n²+n+1에서 n이 매우 커질수록 최고차항 n²이 전체에서 차지하는 비율은 몇 %에 가까워지는가?</w:t>
       </w:r>
       <w:r>
         <w:rPr>
@@ -6641,7 +6641,7 @@
           <w:sz w:val="21"/>
           <w:szCs w:val="21"/>
         </w:rPr>
-        <w:t xml:space="preserve">T(n) = n² + n + 1 에서 n = 1,000일 때 최고차항 n²이 전체에서 차지하는 비율을 대략 쓰시오.</w:t>
+        <w:t xml:space="preserve"/>
       </w:r>
     </w:p>
     <w:p>
@@ -6770,7 +6770,7 @@
           <w:sz w:val="21"/>
           <w:szCs w:val="21"/>
         </w:rPr>
-        <w:t xml:space="preserve">50. </w:t>
+        <w:t xml:space="preserve">50. 두 알고리즘의 연산 횟수는 T₁(n)=n², T₂(n)=n log₂n이다. n=1,000,000, log₂n≈20일 때 각각의 연산 횟수를 쓰시오. 곱셈식으로 답해도 된다.</w:t>
       </w:r>
       <w:r>
         <w:rPr>
@@ -6779,7 +6779,7 @@
           <w:sz w:val="21"/>
           <w:szCs w:val="21"/>
         </w:rPr>
-        <w:t xml:space="preserve">n = 1,000,000일 때 O(n²) 알고리즘과 O(n log n) 알고리즘의 대략적인 연산 횟수를 각각 쓰시오.</w:t>
+        <w:t xml:space="preserve"/>
       </w:r>
     </w:p>
     <w:p>
@@ -6821,7 +6821,7 @@
           <w:sz w:val="28"/>
           <w:szCs w:val="28"/>
         </w:rPr>
-        <w:t xml:space="preserve">정답 및 해설</w:t>
+        <w:t xml:space="preserve">정답  10¹²회, 약 2×10⁷회</w:t>
       </w:r>
     </w:p>
     <w:p>
@@ -9621,18 +9621,18 @@
           <w:sz w:val="20"/>
           <w:szCs w:val="20"/>
         </w:rPr>
-        <w:t xml:space="preserve">17. </w:t>
-      </w:r>
-      <w:r>
-        <w:rPr>
-          <w:rFonts w:ascii="Malgun Gothic" w:cs="Malgun Gothic" w:eastAsia="Malgun Gothic" w:hAnsi="Malgun Gothic"/>
-          <w:b/>
-          <w:bCs/>
-          <w:color w:val="1A1A2E"/>
-          <w:sz w:val="20"/>
-          <w:szCs w:val="20"/>
-        </w:rPr>
-        <w:t xml:space="preserve">정렬된 데이터에서 순차 탐색의 최대 비교 횟수는 n회, 이진 탐색은 약 log₂n회다. 두 값의 비율이 약 50,000배가 되는 데이터 개수 n은?</w:t>
+        <w:t xml:space="preserve">17. 정렬된 원소가 1,000,000개다. 순차 탐색은 최대 1,000,000회, 이진 탐색은 약 20회 비교한다. 순차 탐색의 비교 횟수는 이진 탐색의 약 몇 배인가?</w:t>
+      </w:r>
+      <w:r>
+        <w:rPr>
+          <w:rFonts w:ascii="Malgun Gothic" w:cs="Malgun Gothic" w:eastAsia="Malgun Gothic" w:hAnsi="Malgun Gothic"/>
+          <w:b/>
+          <w:bCs/>
+          <w:color w:val="1A1A2E"/>
+          <w:sz w:val="20"/>
+          <w:szCs w:val="20"/>
+        </w:rPr>
+        <w:t xml:space="preserve"/>
       </w:r>
     </w:p>
     <w:p>
@@ -9649,7 +9649,7 @@
           <w:sz w:val="19"/>
           <w:szCs w:val="19"/>
         </w:rPr>
-        <w:t xml:space="preserve">① 32</w:t>
+        <w:t xml:space="preserve">① 5배</w:t>
       </w:r>
     </w:p>
     <w:p>
@@ -9666,7 +9666,7 @@
           <w:sz w:val="19"/>
           <w:szCs w:val="19"/>
         </w:rPr>
-        <w:t xml:space="preserve">② 1,000</w:t>
+        <w:t xml:space="preserve">② 20배</w:t>
       </w:r>
     </w:p>
     <w:p>
@@ -9683,24 +9683,24 @@
           <w:sz w:val="19"/>
           <w:szCs w:val="19"/>
         </w:rPr>
-        <w:t xml:space="preserve">③ 10,000</w:t>
-      </w:r>
-    </w:p>
-    <w:p>
-      <w:pPr>
-        <w:spacing w:after="20" w:line="276"/>
-        <w:ind w:left="760" w:hanging="320"/>
-      </w:pPr>
-      <w:r>
-        <w:rPr>
-          <w:rFonts w:ascii="Malgun Gothic" w:cs="Malgun Gothic" w:eastAsia="Malgun Gothic" w:hAnsi="Malgun Gothic"/>
-          <w:b/>
-          <w:bCs/>
-          <w:color w:val="3B3486"/>
-          <w:sz w:val="19"/>
-          <w:szCs w:val="19"/>
-        </w:rPr>
-        <w:t xml:space="preserve">④ 1,000,000</w:t>
+        <w:t xml:space="preserve">③ 1,000배</w:t>
+      </w:r>
+    </w:p>
+    <w:p>
+      <w:pPr>
+        <w:spacing w:after="20" w:line="276"/>
+        <w:ind w:left="760" w:hanging="320"/>
+      </w:pPr>
+      <w:r>
+        <w:rPr>
+          <w:rFonts w:ascii="Malgun Gothic" w:cs="Malgun Gothic" w:eastAsia="Malgun Gothic" w:hAnsi="Malgun Gothic"/>
+          <w:b/>
+          <w:bCs/>
+          <w:color w:val="3B3486"/>
+          <w:sz w:val="19"/>
+          <w:szCs w:val="19"/>
+        </w:rPr>
+        <w:t xml:space="preserve">④ 50,000배</w:t>
       </w:r>
     </w:p>
     <w:p>
@@ -9717,7 +9717,7 @@
           <w:sz w:val="19"/>
           <w:szCs w:val="19"/>
         </w:rPr>
-        <w:t xml:space="preserve">⑤ 1,000,000,000</w:t>
+        <w:t xml:space="preserve">⑤ 1,000,000배</w:t>
       </w:r>
     </w:p>
     <w:p>
@@ -9751,7 +9751,7 @@
           <w:sz w:val="19"/>
           <w:szCs w:val="19"/>
         </w:rPr>
-        <w:t xml:space="preserve">해설  </w:t>
+        <w:t xml:space="preserve">해설  1,000,000÷20=50,000이다. 같은 입력에서도 탐색 방법에 따라 비교 횟수가 크게 달라진다.</w:t>
       </w:r>
       <w:r>
         <w:rPr>
@@ -9760,7 +9760,7 @@
           <w:sz w:val="19"/>
           <w:szCs w:val="19"/>
         </w:rPr>
-        <w:t xml:space="preserve">1,000,000 ÷ 20 = 50,000이다. n = 32일 때는 약 5배에 불과했지만 n이 커질수록 비율 자체가 폭발적으로 증가한다. 작은 데이터에서는 알고리즘의 차이가 드러나지 않는다는 것이 핵심이다.</w:t>
+        <w:t xml:space="preserve"/>
       </w:r>
     </w:p>
     <w:p>
@@ -11393,18 +11393,18 @@
           <w:sz w:val="20"/>
           <w:szCs w:val="20"/>
         </w:rPr>
-        <w:t xml:space="preserve">26. </w:t>
-      </w:r>
-      <w:r>
-        <w:rPr>
-          <w:rFonts w:ascii="Malgun Gothic" w:cs="Malgun Gothic" w:eastAsia="Malgun Gothic" w:hAnsi="Malgun Gothic"/>
-          <w:b/>
-          <w:bCs/>
-          <w:color w:val="1A1A2E"/>
-          <w:sz w:val="20"/>
-          <w:szCs w:val="20"/>
-        </w:rPr>
-        <w:t xml:space="preserve">T(n) = 3n² + 5n + 100 을 빅오 표기법으로 나타내면?</w:t>
+        <w:t xml:space="preserve">26. T(n)=3n²+5n+100에서 최고차항만 남기고 계수를 생략한 빅오 표기는?</w:t>
+      </w:r>
+      <w:r>
+        <w:rPr>
+          <w:rFonts w:ascii="Malgun Gothic" w:cs="Malgun Gothic" w:eastAsia="Malgun Gothic" w:hAnsi="Malgun Gothic"/>
+          <w:b/>
+          <w:bCs/>
+          <w:color w:val="1A1A2E"/>
+          <w:sz w:val="20"/>
+          <w:szCs w:val="20"/>
+        </w:rPr>
+        <w:t xml:space="preserve"/>
       </w:r>
     </w:p>
     <w:p>
@@ -11472,7 +11472,7 @@
           <w:sz w:val="19"/>
           <w:szCs w:val="19"/>
         </w:rPr>
-        <w:t xml:space="preserve">④ O(3n²)</w:t>
+        <w:t xml:space="preserve">④ O(n³)</w:t>
       </w:r>
     </w:p>
     <w:p>
@@ -11489,7 +11489,7 @@
           <w:sz w:val="19"/>
           <w:szCs w:val="19"/>
         </w:rPr>
-        <w:t xml:space="preserve">⑤ O(n² + n)</w:t>
+        <w:t xml:space="preserve">⑤ O(2ⁿ)</w:t>
       </w:r>
     </w:p>
     <w:p>
@@ -11523,7 +11523,7 @@
           <w:sz w:val="19"/>
           <w:szCs w:val="19"/>
         </w:rPr>
-        <w:t xml:space="preserve">해설  </w:t>
+        <w:t xml:space="preserve">해설  최고차항은 3n²이므로 가장 타이트한 상한은 O(n²)이다. O(n³), O(2ⁿ)도 상한이지만 필요 이상으로 크다.</w:t>
       </w:r>
       <w:r>
         <w:rPr>
@@ -11532,7 +11532,7 @@
           <w:sz w:val="19"/>
           <w:szCs w:val="19"/>
         </w:rPr>
-        <w:t xml:space="preserve">최고차항만 남기고 계수와 낮은 차수 항은 버린다. 계수 3을 버리는 이유는 n이 커질 때 차수의 차이 앞에서 상수배는 의미가 없기 때문이다. O(3n²)이나 O(n²+n)처럼 쓰지 않는 것이 관례다.</w:t>
+        <w:t xml:space="preserve"/>
       </w:r>
     </w:p>
     <w:p>
@@ -13531,18 +13531,18 @@
           <w:sz w:val="20"/>
           <w:szCs w:val="20"/>
         </w:rPr>
-        <w:t xml:space="preserve">43. </w:t>
-      </w:r>
-      <w:r>
-        <w:rPr>
-          <w:rFonts w:ascii="Malgun Gothic" w:cs="Malgun Gothic" w:eastAsia="Malgun Gothic" w:hAnsi="Malgun Gothic"/>
-          <w:b/>
-          <w:bCs/>
-          <w:color w:val="1A1A2E"/>
-          <w:sz w:val="20"/>
-          <w:szCs w:val="20"/>
-        </w:rPr>
-        <w:t xml:space="preserve">다음 코드의 T(n)을 쓰시오. (n = len(A))</w:t>
+        <w:t xml:space="preserve">43. 안쪽 반복문의 덧셈 실행 횟수 T(n)은? (n=len(A), 다른 연산은 제외)</w:t>
+      </w:r>
+      <w:r>
+        <w:rPr>
+          <w:rFonts w:ascii="Malgun Gothic" w:cs="Malgun Gothic" w:eastAsia="Malgun Gothic" w:hAnsi="Malgun Gothic"/>
+          <w:b/>
+          <w:bCs/>
+          <w:color w:val="1A1A2E"/>
+          <w:sz w:val="20"/>
+          <w:szCs w:val="20"/>
+        </w:rPr>
+        <w:t xml:space="preserve"/>
       </w:r>
     </w:p>
     <w:p>
@@ -13671,18 +13671,18 @@
           <w:sz w:val="19"/>
           <w:szCs w:val="19"/>
         </w:rPr>
-        <w:t xml:space="preserve">정답:  </w:t>
-      </w:r>
-      <w:r>
-        <w:rPr>
-          <w:rFonts w:ascii="Malgun Gothic" w:cs="Malgun Gothic" w:eastAsia="Malgun Gothic" w:hAnsi="Malgun Gothic"/>
-          <w:b/>
-          <w:bCs/>
-          <w:color w:val="1A1A2E"/>
-          <w:sz w:val="19"/>
-          <w:szCs w:val="19"/>
-        </w:rPr>
-        <w:t xml:space="preserve">T(n) = n²  ( = O(n²) )</w:t>
+        <w:t xml:space="preserve">정답  T(n)=n²</w:t>
+      </w:r>
+      <w:r>
+        <w:rPr>
+          <w:rFonts w:ascii="Malgun Gothic" w:cs="Malgun Gothic" w:eastAsia="Malgun Gothic" w:hAnsi="Malgun Gothic"/>
+          <w:b/>
+          <w:bCs/>
+          <w:color w:val="1A1A2E"/>
+          <w:sz w:val="19"/>
+          <w:szCs w:val="19"/>
+        </w:rPr>
+        <w:t xml:space="preserve"/>
       </w:r>
     </w:p>
     <w:p>
@@ -13699,7 +13699,7 @@
           <w:sz w:val="19"/>
           <w:szCs w:val="19"/>
         </w:rPr>
-        <w:t xml:space="preserve">해설:  </w:t>
+        <w:t xml:space="preserve">해설  바깥 반복문 n회마다 안쪽 덧셈이 n회 실행되므로 총 n×n=n²회이다.</w:t>
       </w:r>
       <w:r>
         <w:rPr>
@@ -13710,7 +13710,7 @@
           <w:sz w:val="19"/>
           <w:szCs w:val="19"/>
         </w:rPr>
-        <w:t xml:space="preserve">바깥 n회 × 안쪽 n회.</w:t>
+        <w:t xml:space="preserve"/>
       </w:r>
     </w:p>
     <w:p>
@@ -14171,18 +14171,18 @@
           <w:sz w:val="20"/>
           <w:szCs w:val="20"/>
         </w:rPr>
-        <w:t xml:space="preserve">47. </w:t>
-      </w:r>
-      <w:r>
-        <w:rPr>
-          <w:rFonts w:ascii="Malgun Gothic" w:cs="Malgun Gothic" w:eastAsia="Malgun Gothic" w:hAnsi="Malgun Gothic"/>
-          <w:b/>
-          <w:bCs/>
-          <w:color w:val="1A1A2E"/>
-          <w:sz w:val="20"/>
-          <w:szCs w:val="20"/>
-        </w:rPr>
-        <w:t xml:space="preserve">T(n) = n² + n + 1 에서 n = 1,000일 때 최고차항 n²이 전체에서 차지하는 비율을 대략 쓰시오.</w:t>
+        <w:t xml:space="preserve">47. T(n)=n²+n+1에서 n이 매우 커질수록 최고차항 n²이 전체에서 차지하는 비율은 몇 %에 가까워지는가?</w:t>
+      </w:r>
+      <w:r>
+        <w:rPr>
+          <w:rFonts w:ascii="Malgun Gothic" w:cs="Malgun Gothic" w:eastAsia="Malgun Gothic" w:hAnsi="Malgun Gothic"/>
+          <w:b/>
+          <w:bCs/>
+          <w:color w:val="1A1A2E"/>
+          <w:sz w:val="20"/>
+          <w:szCs w:val="20"/>
+        </w:rPr>
+        <w:t xml:space="preserve"/>
       </w:r>
     </w:p>
     <w:p>
@@ -14199,18 +14199,18 @@
           <w:sz w:val="19"/>
           <w:szCs w:val="19"/>
         </w:rPr>
-        <w:t xml:space="preserve">정답:  </w:t>
-      </w:r>
-      <w:r>
-        <w:rPr>
-          <w:rFonts w:ascii="Malgun Gothic" w:cs="Malgun Gothic" w:eastAsia="Malgun Gothic" w:hAnsi="Malgun Gothic"/>
-          <w:b/>
-          <w:bCs/>
-          <w:color w:val="1A1A2E"/>
-          <w:sz w:val="19"/>
-          <w:szCs w:val="19"/>
-        </w:rPr>
-        <w:t xml:space="preserve">약 99.9% (1,000,000 ÷ 1,001,001)</w:t>
+        <w:t xml:space="preserve">정답  100%</w:t>
+      </w:r>
+      <w:r>
+        <w:rPr>
+          <w:rFonts w:ascii="Malgun Gothic" w:cs="Malgun Gothic" w:eastAsia="Malgun Gothic" w:hAnsi="Malgun Gothic"/>
+          <w:b/>
+          <w:bCs/>
+          <w:color w:val="1A1A2E"/>
+          <w:sz w:val="19"/>
+          <w:szCs w:val="19"/>
+        </w:rPr>
+        <w:t xml:space="preserve"/>
       </w:r>
     </w:p>
     <w:p>
@@ -14227,7 +14227,7 @@
           <w:sz w:val="19"/>
           <w:szCs w:val="19"/>
         </w:rPr>
-        <w:t xml:space="preserve">해설:  </w:t>
+        <w:t xml:space="preserve">해설  n²으로 나누면 비율은 1/(1+1/n+1/n²)이다. n이 커질수록 1, 즉 100%에 가까워진다. 소수점 나눗셈은 필요 없다.</w:t>
       </w:r>
       <w:r>
         <w:rPr>
@@ -14238,7 +14238,7 @@
           <w:sz w:val="19"/>
           <w:szCs w:val="19"/>
         </w:rPr>
-        <w:t xml:space="preserve">n이 커질수록 이 비율은 100%에 가까워진다. 낮은 차수 항을 버리는 근거가 여기에 있다.</w:t>
+        <w:t xml:space="preserve"/>
       </w:r>
     </w:p>
     <w:p>
@@ -14423,18 +14423,18 @@
           <w:sz w:val="20"/>
           <w:szCs w:val="20"/>
         </w:rPr>
-        <w:t xml:space="preserve">50. </w:t>
-      </w:r>
-      <w:r>
-        <w:rPr>
-          <w:rFonts w:ascii="Malgun Gothic" w:cs="Malgun Gothic" w:eastAsia="Malgun Gothic" w:hAnsi="Malgun Gothic"/>
-          <w:b/>
-          <w:bCs/>
-          <w:color w:val="1A1A2E"/>
-          <w:sz w:val="20"/>
-          <w:szCs w:val="20"/>
-        </w:rPr>
-        <w:t xml:space="preserve">n = 1,000,000일 때 O(n²) 알고리즘과 O(n log n) 알고리즘의 대략적인 연산 횟수를 각각 쓰시오.</w:t>
+        <w:t xml:space="preserve">50. 두 알고리즘의 연산 횟수는 T₁(n)=n², T₂(n)=n log₂n이다. n=1,000,000, log₂n≈20일 때 각각의 연산 횟수를 쓰시오. 곱셈식으로 답해도 된다.</w:t>
+      </w:r>
+      <w:r>
+        <w:rPr>
+          <w:rFonts w:ascii="Malgun Gothic" w:cs="Malgun Gothic" w:eastAsia="Malgun Gothic" w:hAnsi="Malgun Gothic"/>
+          <w:b/>
+          <w:bCs/>
+          <w:color w:val="1A1A2E"/>
+          <w:sz w:val="20"/>
+          <w:szCs w:val="20"/>
+        </w:rPr>
+        <w:t xml:space="preserve"/>
       </w:r>
     </w:p>
     <w:p>
@@ -14451,18 +14451,18 @@
           <w:sz w:val="19"/>
           <w:szCs w:val="19"/>
         </w:rPr>
-        <w:t xml:space="preserve">정답:  </w:t>
-      </w:r>
-      <w:r>
-        <w:rPr>
-          <w:rFonts w:ascii="Malgun Gothic" w:cs="Malgun Gothic" w:eastAsia="Malgun Gothic" w:hAnsi="Malgun Gothic"/>
-          <w:b/>
-          <w:bCs/>
-          <w:color w:val="1A1A2E"/>
-          <w:sz w:val="19"/>
-          <w:szCs w:val="19"/>
-        </w:rPr>
-        <w:t xml:space="preserve">약 10¹²회(1조), 약 2 × 10⁷회(2천만)</w:t>
+        <w:t xml:space="preserve">정답  10¹²회, 약 2×10⁷회</w:t>
+      </w:r>
+      <w:r>
+        <w:rPr>
+          <w:rFonts w:ascii="Malgun Gothic" w:cs="Malgun Gothic" w:eastAsia="Malgun Gothic" w:hAnsi="Malgun Gothic"/>
+          <w:b/>
+          <w:bCs/>
+          <w:color w:val="1A1A2E"/>
+          <w:sz w:val="19"/>
+          <w:szCs w:val="19"/>
+        </w:rPr>
+        <w:t xml:space="preserve"/>
       </w:r>
     </w:p>
     <w:p>
@@ -14479,7 +14479,7 @@
           <w:sz w:val="19"/>
           <w:szCs w:val="19"/>
         </w:rPr>
-        <w:t xml:space="preserve">해설:  </w:t>
+        <w:t xml:space="preserve">해설  T₁=10⁶×10⁶, T₂≈10⁶×20이다. 빅오만으로 실제 연산 횟수를 알 수는 없으므로 문제에 제시한 T₁, T₂를 이용한다.</w:t>
       </w:r>
       <w:r>
         <w:rPr>
@@ -14490,7 +14490,7 @@
           <w:sz w:val="19"/>
           <w:szCs w:val="19"/>
         </w:rPr>
-        <w:t xml:space="preserve">n log n은 10⁶ × 20이다. 100만 규모에서 O(n²)은 사실상 사용할 수 없다.</w:t>
+        <w:t xml:space="preserve"/>
       </w:r>
     </w:p>
     <w:sectPr>

</xml_diff>